<commit_message>
TS 5.4 Kramam tamil
</commit_message>
<xml_diff>
--- a/TS-Kramam/TS-5.5/TS 5.5 Tamil Krama Paatam Corrections.docx
+++ b/TS-Kramam/TS-5.5/TS 5.5 Tamil Krama Paatam Corrections.docx
@@ -81,18 +81,7 @@
           <w:szCs w:val="32"/>
           <w:u w:val="single"/>
         </w:rPr>
-        <w:t xml:space="preserve">Observed </w:t>
-      </w:r>
-      <w:proofErr w:type="gramStart"/>
-      <w:r>
-        <w:rPr>
-          <w:b/>
-          <w:bCs/>
-          <w:sz w:val="32"/>
-          <w:szCs w:val="32"/>
-          <w:u w:val="single"/>
-        </w:rPr>
-        <w:t xml:space="preserve">till </w:t>
+        <w:t xml:space="preserve">Observed till </w:t>
       </w:r>
       <w:r>
         <w:rPr>
@@ -105,7 +94,6 @@
         </w:rPr>
         <w:t>?????</w:t>
       </w:r>
-      <w:proofErr w:type="gramEnd"/>
     </w:p>
     <w:p>
       <w:pPr>
@@ -153,12 +141,16 @@
               <w:spacing w:before="0" w:line="240" w:lineRule="auto"/>
               <w:jc w:val="center"/>
               <w:rPr>
+                <w:b/>
+                <w:bCs/>
                 <w:sz w:val="32"/>
                 <w:szCs w:val="32"/>
               </w:rPr>
             </w:pPr>
             <w:r>
               <w:rPr>
+                <w:b/>
+                <w:bCs/>
                 <w:sz w:val="32"/>
                 <w:szCs w:val="32"/>
               </w:rPr>
@@ -170,12 +162,16 @@
               <w:spacing w:before="0" w:line="240" w:lineRule="auto"/>
               <w:jc w:val="center"/>
               <w:rPr>
+                <w:b/>
+                <w:bCs/>
                 <w:sz w:val="32"/>
                 <w:szCs w:val="32"/>
               </w:rPr>
             </w:pPr>
             <w:r>
               <w:rPr>
+                <w:b/>
+                <w:bCs/>
                 <w:sz w:val="32"/>
                 <w:szCs w:val="32"/>
               </w:rPr>
@@ -192,12 +188,16 @@
               <w:spacing w:before="0" w:line="240" w:lineRule="auto"/>
               <w:jc w:val="center"/>
               <w:rPr>
+                <w:b/>
+                <w:bCs/>
                 <w:sz w:val="32"/>
                 <w:szCs w:val="32"/>
               </w:rPr>
             </w:pPr>
             <w:r>
               <w:rPr>
+                <w:b/>
+                <w:bCs/>
                 <w:sz w:val="32"/>
                 <w:szCs w:val="32"/>
               </w:rPr>
@@ -215,12 +215,16 @@
               <w:ind w:right="-18"/>
               <w:jc w:val="center"/>
               <w:rPr>
+                <w:b/>
+                <w:bCs/>
                 <w:sz w:val="32"/>
                 <w:szCs w:val="32"/>
               </w:rPr>
             </w:pPr>
             <w:r>
               <w:rPr>
+                <w:b/>
+                <w:bCs/>
                 <w:sz w:val="32"/>
                 <w:szCs w:val="32"/>
               </w:rPr>
@@ -1860,6 +1864,84 @@
         </w:tc>
       </w:tr>
     </w:tbl>
+    <w:p>
+      <w:pPr>
+        <w:jc w:val="center"/>
+        <w:rPr>
+          <w:b/>
+          <w:bCs/>
+          <w:sz w:val="32"/>
+          <w:szCs w:val="32"/>
+          <w:u w:val="single"/>
+          <w:lang w:val="it-IT"/>
+        </w:rPr>
+      </w:pPr>
+    </w:p>
+    <w:p>
+      <w:pPr>
+        <w:jc w:val="center"/>
+        <w:rPr>
+          <w:b/>
+          <w:bCs/>
+          <w:sz w:val="32"/>
+          <w:szCs w:val="32"/>
+          <w:u w:val="single"/>
+          <w:lang w:val="it-IT"/>
+        </w:rPr>
+      </w:pPr>
+    </w:p>
+    <w:p>
+      <w:pPr>
+        <w:jc w:val="center"/>
+        <w:rPr>
+          <w:b/>
+          <w:bCs/>
+          <w:sz w:val="32"/>
+          <w:szCs w:val="32"/>
+          <w:u w:val="single"/>
+          <w:lang w:val="it-IT"/>
+        </w:rPr>
+      </w:pPr>
+    </w:p>
+    <w:p>
+      <w:pPr>
+        <w:jc w:val="center"/>
+        <w:rPr>
+          <w:b/>
+          <w:bCs/>
+          <w:sz w:val="32"/>
+          <w:szCs w:val="32"/>
+          <w:u w:val="single"/>
+          <w:lang w:val="it-IT"/>
+        </w:rPr>
+      </w:pPr>
+    </w:p>
+    <w:p>
+      <w:pPr>
+        <w:jc w:val="center"/>
+        <w:rPr>
+          <w:b/>
+          <w:bCs/>
+          <w:sz w:val="32"/>
+          <w:szCs w:val="32"/>
+          <w:u w:val="single"/>
+          <w:lang w:val="it-IT"/>
+        </w:rPr>
+      </w:pPr>
+    </w:p>
+    <w:p>
+      <w:pPr>
+        <w:jc w:val="center"/>
+        <w:rPr>
+          <w:b/>
+          <w:bCs/>
+          <w:sz w:val="32"/>
+          <w:szCs w:val="32"/>
+          <w:u w:val="single"/>
+          <w:lang w:val="it-IT"/>
+        </w:rPr>
+      </w:pPr>
+    </w:p>
     <w:p>
       <w:pPr>
         <w:jc w:val="center"/>
@@ -1892,6 +1974,7 @@
           <w:szCs w:val="32"/>
           <w:u w:val="single"/>
         </w:rPr>
+        <w:lastRenderedPageBreak/>
         <w:t xml:space="preserve">TS </w:t>
       </w:r>
       <w:r>
@@ -2548,7 +2631,6 @@
                 <w:cs/>
                 <w:lang w:bidi="ta-IN"/>
               </w:rPr>
-              <w:lastRenderedPageBreak/>
               <w:t>ரா</w:t>
             </w:r>
             <w:r>
@@ -2650,7 +2732,6 @@
                 <w:cs/>
                 <w:lang w:bidi="ta-IN"/>
               </w:rPr>
-              <w:lastRenderedPageBreak/>
               <w:t>வரு</w:t>
             </w:r>
             <w:r>
@@ -2901,7 +2982,6 @@
                 <w:cs/>
                 <w:lang w:bidi="ta-IN"/>
               </w:rPr>
-              <w:lastRenderedPageBreak/>
               <w:t>ரா</w:t>
             </w:r>
             <w:r>
@@ -2998,7 +3078,6 @@
           <w:szCs w:val="32"/>
           <w:u w:val="single"/>
         </w:rPr>
-        <w:lastRenderedPageBreak/>
         <w:t>========</w:t>
       </w:r>
     </w:p>
@@ -4780,6 +4859,7 @@
                 <w:sz w:val="28"/>
                 <w:szCs w:val="32"/>
               </w:rPr>
+              <w:lastRenderedPageBreak/>
               <w:t>T.S.5.5.3.1 – Kramam</w:t>
             </w:r>
           </w:p>
@@ -5882,7 +5962,6 @@
                 <w:sz w:val="28"/>
                 <w:szCs w:val="32"/>
               </w:rPr>
-              <w:lastRenderedPageBreak/>
               <w:t>T.S.5.5.7.4 – Kramam</w:t>
             </w:r>
           </w:p>
@@ -8418,6 +8497,7 @@
                 <w:sz w:val="28"/>
                 <w:szCs w:val="32"/>
               </w:rPr>
+              <w:lastRenderedPageBreak/>
               <w:t>T.S.5.5.10.2 – Kramam</w:t>
             </w:r>
           </w:p>
@@ -9371,7 +9451,6 @@
                 <w:cs/>
                 <w:lang w:bidi="ta-IN"/>
               </w:rPr>
-              <w:lastRenderedPageBreak/>
               <w:t>தி</w:t>
             </w:r>
             <w:r>
@@ -10685,6 +10764,7 @@
                 <w:sz w:val="28"/>
                 <w:szCs w:val="32"/>
               </w:rPr>
+              <w:lastRenderedPageBreak/>
               <w:t>T.S.5.5.23.1 – Kramam</w:t>
             </w:r>
           </w:p>
@@ -11722,16 +11802,7 @@
           <w:bCs/>
           <w:sz w:val="32"/>
         </w:rPr>
-        <w:t xml:space="preserve">replaced </w:t>
-      </w:r>
-      <w:proofErr w:type="gramStart"/>
-      <w:r>
-        <w:rPr>
-          <w:b/>
-          <w:bCs/>
-          <w:sz w:val="32"/>
-        </w:rPr>
-        <w:t>with</w:t>
+        <w:t>replaced with</w:t>
       </w:r>
       <w:r>
         <w:rPr>
@@ -11753,7 +11824,6 @@
         </w:rPr>
         <w:t>"</w:t>
       </w:r>
-      <w:proofErr w:type="gramEnd"/>
       <w:r>
         <w:rPr>
           <w:rFonts w:ascii="Latha" w:hAnsi="Latha" w:cs="Latha"/>
@@ -11798,6 +11868,40 @@
         </w:rPr>
         <w:t>wherever applicable</w:t>
       </w:r>
+    </w:p>
+    <w:p>
+      <w:pPr>
+        <w:jc w:val="center"/>
+        <w:rPr>
+          <w:b/>
+          <w:bCs/>
+          <w:sz w:val="32"/>
+          <w:szCs w:val="32"/>
+          <w:u w:val="single"/>
+        </w:rPr>
+      </w:pPr>
+      <w:r>
+        <w:rPr>
+          <w:b/>
+          <w:bCs/>
+          <w:sz w:val="32"/>
+          <w:szCs w:val="32"/>
+          <w:u w:val="single"/>
+        </w:rPr>
+        <w:t>================================</w:t>
+      </w:r>
+    </w:p>
+    <w:p>
+      <w:pPr>
+        <w:jc w:val="center"/>
+        <w:rPr>
+          <w:b/>
+          <w:bCs/>
+          <w:sz w:val="32"/>
+          <w:szCs w:val="32"/>
+          <w:u w:val="single"/>
+        </w:rPr>
+      </w:pPr>
     </w:p>
     <w:p>
       <w:pPr>
@@ -12105,7 +12209,6 @@
                 <w:sz w:val="32"/>
                 <w:szCs w:val="36"/>
               </w:rPr>
-              <w:lastRenderedPageBreak/>
               <w:t>None</w:t>
             </w:r>
           </w:p>
@@ -12177,6 +12280,14 @@
           <w:sz w:val="32"/>
         </w:rPr>
       </w:pPr>
+      <w:r>
+        <w:rPr>
+          <w:rFonts w:cs="Arial"/>
+          <w:b/>
+          <w:sz w:val="32"/>
+        </w:rPr>
+        <w:t>====================================</w:t>
+      </w:r>
     </w:p>
     <w:sectPr>
       <w:headerReference w:type="even" r:id="rId7"/>
@@ -12224,6 +12335,7 @@
       <w:pBdr>
         <w:top w:val="single" w:sz="4" w:space="1" w:color="auto"/>
       </w:pBdr>
+      <w:jc w:val="right"/>
       <w:rPr>
         <w:b/>
         <w:bCs/>
@@ -12270,14 +12382,21 @@
         <w:bCs/>
       </w:rPr>
       <w:tab/>
-      <w:t xml:space="preserve">              v</w:t>
+      <w:t xml:space="preserve">              </w:t>
     </w:r>
     <w:r>
       <w:rPr>
         <w:b/>
         <w:bCs/>
       </w:rPr>
-      <w:t>edavms@gmail.com</w:t>
+      <w:t>www.vedavms.in</w:t>
+    </w:r>
+    <w:r>
+      <w:rPr>
+        <w:b/>
+        <w:bCs/>
+      </w:rPr>
+      <w:t xml:space="preserve">  </w:t>
     </w:r>
     <w:r>
       <w:rPr>
@@ -12301,7 +12420,7 @@
       <w:tab/>
     </w:r>
     <w:r>
-      <w:tab/>
+      <w:t xml:space="preserve">                      </w:t>
     </w:r>
     <w:r>
       <w:rPr>
@@ -12405,6 +12524,7 @@
       <w:pBdr>
         <w:top w:val="single" w:sz="4" w:space="1" w:color="auto"/>
       </w:pBdr>
+      <w:jc w:val="right"/>
       <w:rPr>
         <w:b/>
         <w:bCs/>
@@ -12493,6 +12613,9 @@
     </w:r>
     <w:r>
       <w:tab/>
+    </w:r>
+    <w:r>
+      <w:t xml:space="preserve">                     </w:t>
     </w:r>
     <w:r>
       <w:tab/>
@@ -13155,6 +13278,29 @@
       <w:lang w:bidi="ar-SA"/>
     </w:rPr>
   </w:style>
+  <w:style w:type="character" w:styleId="Hyperlink">
+    <w:name w:val="Hyperlink"/>
+    <w:basedOn w:val="DefaultParagraphFont"/>
+    <w:uiPriority w:val="99"/>
+    <w:unhideWhenUsed/>
+    <w:rsid w:val="002207BA"/>
+    <w:rPr>
+      <w:color w:val="0563C1" w:themeColor="hyperlink"/>
+      <w:u w:val="single"/>
+    </w:rPr>
+  </w:style>
+  <w:style w:type="character" w:styleId="UnresolvedMention">
+    <w:name w:val="Unresolved Mention"/>
+    <w:basedOn w:val="DefaultParagraphFont"/>
+    <w:uiPriority w:val="99"/>
+    <w:semiHidden/>
+    <w:unhideWhenUsed/>
+    <w:rsid w:val="002207BA"/>
+    <w:rPr>
+      <w:color w:val="605E5C"/>
+      <w:shd w:val="clear" w:color="auto" w:fill="E1DFDD"/>
+    </w:rPr>
+  </w:style>
 </w:styles>
 </file>
 

</xml_diff>